<commit_message>
Add bounded virtual-cell context to Discussion
</commit_message>
<xml_diff>
--- a/manuscript_v1/Manuscript_BMC_Genomics_draft.docx
+++ b/manuscript_v1/Manuscript_BMC_Genomics_draft.docx
@@ -4170,7 +4170,7 @@
           <w:sz w:val="24"/>
           <w:szCs w:val="24"/>
         </w:rPr>
-        <w:t xml:space="preserve">Tissue reference performance and molecular zero solutions further constrain interpretation. Both the response-associated pair pipeline and the strong-expression model improved on the tissue-only reference in the development evaluation, but the difference between those molecular models did not favor REO on average. Nearly half of the outer-fold molecular fits and more than half of the final molecular model arms selected the exact zero-coefficient endpoint. In those fits, prediction retains the tissue component and the associated correlation does not demonstrate that a molecular pattern was learned. The three exact-zero external primary differences are an especially clear example: both compared models had zero molecular coefficients, so identical predictions yielded a zero contrast by construction.</w:t>
+        <w:t xml:space="preserve">Tissue reference performance and molecular zero solutions further constrain interpretation. Both the response-associated pair pipeline and the strong-expression model improved on the tissue-only reference in the development evaluation, but the difference between those molecular models did not favor REO on average. Approximately half of the outer-fold molecular fits and more than half of the final molecular model arms selected the exact zero-coefficient endpoint. In those fits, prediction retains the tissue component and the associated correlation does not demonstrate that a molecular pattern was learned. The three exact-zero external primary differences are an especially clear example: both compared models had zero molecular coefficients, so identical predictions yielded a zero contrast by construction.</w:t>
       </w:r>
     </w:p>
     <w:p>
@@ -4185,6 +4185,20 @@
           <w:szCs w:val="24"/>
         </w:rPr>
         <w:t xml:space="preserve">The cross-screen evaluation is best interpreted as retrospective within-drug ranking transport from GDSC2 responses to CTRPv2 responses under a shared CCLE expression source. Cross-study analyses and recent evaluation frameworks show that assay protocols, dose ranges, response summaries, and aggregation choices can affect agreement and model transport [3,4,6,22,23]. The current evaluation does not test transfer to a different expression-measurement platform, absolute calibration between source AUC values, prospective prediction, or patient outcome. CTRPv2 had been used in an earlier project manuscript, so the present locked execution should not be described as wholly blind in the project's history. The zero-prediction-abstention coverage is complete for the locked eligible set, but complete coverage alone does not imply strong predictive value.</w:t>
+      </w:r>
+    </w:p>
+    <w:p>
+      <w:pPr>
+        <w:keepNext w:val="false"/>
+        <w:spacing w:after="120" w:before="0" w:line="480"/>
+      </w:pPr>
+      <w:r>
+        <w:rPr>
+          <w:rFonts w:ascii="Times New Roman" w:cs="Times New Roman" w:eastAsia="Times New Roman" w:hAnsi="Times New Roman"/>
+          <w:sz w:val="24"/>
+          <w:szCs w:val="24"/>
+        </w:rPr>
+        <w:t xml:space="preserve">Recent single-cell perturbation benchmarks highlight the need for task-appropriate baselines and explicit evaluation targets. Simple linear baselines can match or exceed evaluated deep-learning models in some settings [27]. PerturBench examines collapsed predictions [28], while Systema addresses systematic variation in perturbation-prediction evaluation [29]. Gains over uninformative baselines have also been reported using calibrated metrics [30]. Our drug-response analysis provides a complementary, task-specific case study: descriptive representation contrasts varied with the candidate-gene policy, and approximately half of the outer-fold molecular fits selected the zero-coefficient endpoint. These observations motivate reporting covariate-reference performance, molecular increments, representation contrasts, and whether fitted predictions retain a molecular contribution. Selection of an exact zero solution in the present elastic-net pipeline depends on the tuning objective and regularization path and should not be equated with mode collapse in deep perturbation models. The synthetic controls demonstrate behavior under specified mechanisms without identifying the causes of zero solutions in real drug data. Extending these checks to single-cell foundation models requires direct, task-specific evaluation.</w:t>
       </w:r>
     </w:p>
     <w:p>
@@ -5386,6 +5400,138 @@
           <w:szCs w:val="24"/>
         </w:rPr>
         <w:t xml:space="preserve">26. Cell Model Passports. API documentation. Accessed 10 October 2026. https://depmap.sanger.ac.uk/documentation/api/.</w:t>
+      </w:r>
+    </w:p>
+    <w:p>
+      <w:pPr>
+        <w:keepNext w:val="false"/>
+        <w:spacing w:after="120" w:before="0" w:line="480"/>
+        <w:ind w:left="360" w:hanging="360"/>
+      </w:pPr>
+      <w:r>
+        <w:rPr>
+          <w:rFonts w:ascii="Times New Roman" w:cs="Times New Roman" w:eastAsia="Times New Roman" w:hAnsi="Times New Roman"/>
+          <w:sz w:val="24"/>
+          <w:szCs w:val="24"/>
+        </w:rPr>
+        <w:t xml:space="preserve">27. Ahlmann-Eltze C, Huber W, Anders S. Deep-learning-based gene perturbation effect prediction does not yet outperform simple linear baselines. </w:t>
+      </w:r>
+      <w:r>
+        <w:rPr>
+          <w:rFonts w:ascii="Times New Roman" w:cs="Times New Roman" w:eastAsia="Times New Roman" w:hAnsi="Times New Roman"/>
+          <w:i/>
+          <w:iCs/>
+          <w:sz w:val="24"/>
+          <w:szCs w:val="24"/>
+        </w:rPr>
+        <w:t xml:space="preserve">Nat Methods</w:t>
+      </w:r>
+      <w:r>
+        <w:rPr>
+          <w:rFonts w:ascii="Times New Roman" w:cs="Times New Roman" w:eastAsia="Times New Roman" w:hAnsi="Times New Roman"/>
+          <w:sz w:val="24"/>
+          <w:szCs w:val="24"/>
+        </w:rPr>
+        <w:t xml:space="preserve">. 2025;22(8):1657–1661. https://doi.org/10.1038/s41592-025-02772-6.</w:t>
+      </w:r>
+    </w:p>
+    <w:p>
+      <w:pPr>
+        <w:keepNext w:val="false"/>
+        <w:spacing w:after="120" w:before="0" w:line="480"/>
+        <w:ind w:left="360" w:hanging="360"/>
+      </w:pPr>
+      <w:r>
+        <w:rPr>
+          <w:rFonts w:ascii="Times New Roman" w:cs="Times New Roman" w:eastAsia="Times New Roman" w:hAnsi="Times New Roman"/>
+          <w:sz w:val="24"/>
+          <w:szCs w:val="24"/>
+        </w:rPr>
+        <w:t xml:space="preserve">28. Wu Y, et al. PerturBench: Benchmarking Machine Learning Models for Cellular Perturbation Analysis. In: </w:t>
+      </w:r>
+      <w:r>
+        <w:rPr>
+          <w:rFonts w:ascii="Times New Roman" w:cs="Times New Roman" w:eastAsia="Times New Roman" w:hAnsi="Times New Roman"/>
+          <w:i/>
+          <w:iCs/>
+          <w:sz w:val="24"/>
+          <w:szCs w:val="24"/>
+        </w:rPr>
+        <w:t xml:space="preserve">Advances in Neural Information Processing Systems</w:t>
+      </w:r>
+      <w:r>
+        <w:rPr>
+          <w:rFonts w:ascii="Times New Roman" w:cs="Times New Roman" w:eastAsia="Times New Roman" w:hAnsi="Times New Roman"/>
+          <w:sz w:val="24"/>
+          <w:szCs w:val="24"/>
+        </w:rPr>
+        <w:t xml:space="preserve">. 2025;38:106937–106977. https://doi.org/10.52202/085713-3225.</w:t>
+      </w:r>
+    </w:p>
+    <w:p>
+      <w:pPr>
+        <w:keepNext w:val="false"/>
+        <w:spacing w:after="120" w:before="0" w:line="480"/>
+        <w:ind w:left="360" w:hanging="360"/>
+      </w:pPr>
+      <w:r>
+        <w:rPr>
+          <w:rFonts w:ascii="Times New Roman" w:cs="Times New Roman" w:eastAsia="Times New Roman" w:hAnsi="Times New Roman"/>
+          <w:sz w:val="24"/>
+          <w:szCs w:val="24"/>
+        </w:rPr>
+        <w:t xml:space="preserve">29. Viñas Torné R, et al. Systema: a framework for evaluating genetic perturbation response prediction beyond systematic variation. </w:t>
+      </w:r>
+      <w:r>
+        <w:rPr>
+          <w:rFonts w:ascii="Times New Roman" w:cs="Times New Roman" w:eastAsia="Times New Roman" w:hAnsi="Times New Roman"/>
+          <w:i/>
+          <w:iCs/>
+          <w:sz w:val="24"/>
+          <w:szCs w:val="24"/>
+        </w:rPr>
+        <w:t xml:space="preserve">Nat Biotechnol</w:t>
+      </w:r>
+      <w:r>
+        <w:rPr>
+          <w:rFonts w:ascii="Times New Roman" w:cs="Times New Roman" w:eastAsia="Times New Roman" w:hAnsi="Times New Roman"/>
+          <w:sz w:val="24"/>
+          <w:szCs w:val="24"/>
+        </w:rPr>
+        <w:t xml:space="preserve">. 2026;44(6):1050–1059. https://doi.org/10.1038/s41587-025-02777-8.</w:t>
+      </w:r>
+    </w:p>
+    <w:p>
+      <w:pPr>
+        <w:keepNext w:val="false"/>
+        <w:spacing w:after="120" w:before="0" w:line="480"/>
+        <w:ind w:left="360" w:hanging="360"/>
+      </w:pPr>
+      <w:r>
+        <w:rPr>
+          <w:rFonts w:ascii="Times New Roman" w:cs="Times New Roman" w:eastAsia="Times New Roman" w:hAnsi="Times New Roman"/>
+          <w:sz w:val="24"/>
+          <w:szCs w:val="24"/>
+        </w:rPr>
+        <w:t xml:space="preserve">30. Miller HE, Mejia GM, Leblanc FJA, Swain B, Wang B, de Lima Camillo LP. Deep learning perturbation models can outperform baselines on calibrated metrics. </w:t>
+      </w:r>
+      <w:r>
+        <w:rPr>
+          <w:rFonts w:ascii="Times New Roman" w:cs="Times New Roman" w:eastAsia="Times New Roman" w:hAnsi="Times New Roman"/>
+          <w:i/>
+          <w:iCs/>
+          <w:sz w:val="24"/>
+          <w:szCs w:val="24"/>
+        </w:rPr>
+        <w:t xml:space="preserve">Nat Biotechnol</w:t>
+      </w:r>
+      <w:r>
+        <w:rPr>
+          <w:rFonts w:ascii="Times New Roman" w:cs="Times New Roman" w:eastAsia="Times New Roman" w:hAnsi="Times New Roman"/>
+          <w:sz w:val="24"/>
+          <w:szCs w:val="24"/>
+        </w:rPr>
+        <w:t xml:space="preserve">. 2026. Published online 1 October 2026. https://doi.org/10.1038/s41587-026-03307-w.</w:t>
       </w:r>
     </w:p>
     <w:p>

</xml_diff>